<commit_message>
Organiza arquivos do trabalho  T01
</commit_message>
<xml_diff>
--- a/T01_2023004265/relatorio.docx
+++ b/T01_2023004265/relatorio.docx
@@ -19,7 +19,6 @@
     <w:p>
       <w:pPr>
         <w:rPr>
-          <w:rFonts w:hint="eastAsia"/>
           <w:lang w:val="pt-BR"/>
         </w:rPr>
       </w:pPr>
@@ -33,7 +32,6 @@
     <w:p>
       <w:pPr>
         <w:rPr>
-          <w:rFonts w:hint="eastAsia"/>
           <w:lang w:val="pt-BR"/>
         </w:rPr>
       </w:pPr>
@@ -71,7 +69,6 @@
     <w:p>
       <w:pPr>
         <w:rPr>
-          <w:rFonts w:hint="eastAsia"/>
           <w:lang w:val="pt-BR"/>
         </w:rPr>
       </w:pPr>
@@ -85,7 +82,6 @@
     <w:p>
       <w:pPr>
         <w:rPr>
-          <w:rFonts w:hint="eastAsia"/>
           <w:lang w:val="pt-BR"/>
         </w:rPr>
       </w:pPr>
@@ -113,7 +109,6 @@
     <w:p>
       <w:pPr>
         <w:rPr>
-          <w:rFonts w:hint="eastAsia"/>
           <w:lang w:val="pt-BR"/>
         </w:rPr>
       </w:pPr>
@@ -141,7 +136,6 @@
     <w:p>
       <w:pPr>
         <w:rPr>
-          <w:rFonts w:hint="eastAsia"/>
           <w:lang w:val="pt-BR"/>
         </w:rPr>
       </w:pPr>
@@ -183,7 +177,6 @@
     <w:p>
       <w:pPr>
         <w:rPr>
-          <w:rFonts w:hint="eastAsia"/>
           <w:lang w:val="pt-BR"/>
         </w:rPr>
       </w:pPr>
@@ -413,7 +406,6 @@
       <w:pPr>
         <w:spacing w:after="120" w:line="252" w:lineRule="auto"/>
         <w:rPr>
-          <w:rFonts w:hint="eastAsia"/>
           <w:lang w:val="pt-BR"/>
         </w:rPr>
       </w:pPr>
@@ -667,7 +659,6 @@
     <w:p>
       <w:pPr>
         <w:rPr>
-          <w:rFonts w:hint="eastAsia"/>
           <w:lang w:val="pt-BR"/>
         </w:rPr>
       </w:pPr>
@@ -737,7 +728,6 @@
     <w:p>
       <w:pPr>
         <w:rPr>
-          <w:rFonts w:hint="eastAsia"/>
           <w:lang w:val="pt-BR"/>
         </w:rPr>
       </w:pPr>
@@ -752,7 +742,6 @@
       <w:pPr>
         <w:spacing w:after="120" w:line="252" w:lineRule="auto"/>
         <w:rPr>
-          <w:rFonts w:hint="eastAsia"/>
           <w:lang w:val="pt-BR"/>
         </w:rPr>
       </w:pPr>
@@ -1076,7 +1065,6 @@
     <w:p>
       <w:pPr>
         <w:rPr>
-          <w:rFonts w:hint="eastAsia"/>
           <w:lang w:val="pt-BR"/>
         </w:rPr>
       </w:pPr>
@@ -1119,7 +1107,6 @@
     <w:p>
       <w:pPr>
         <w:rPr>
-          <w:rFonts w:hint="eastAsia"/>
           <w:lang w:val="pt-BR"/>
         </w:rPr>
       </w:pPr>
@@ -1153,11 +1140,6 @@
             <w:tcW w:w="3293" w:type="dxa"/>
           </w:tcPr>
           <w:p>
-            <w:pPr>
-              <w:rPr>
-                <w:rFonts w:hint="eastAsia"/>
-              </w:rPr>
-            </w:pPr>
             <w:proofErr w:type="spellStart"/>
             <w:r>
               <w:t>Não</w:t>
@@ -1175,9 +1157,6 @@
           <w:p>
             <w:pPr>
               <w:cnfStyle w:val="100000000000" w:firstRow="1" w:lastRow="0" w:firstColumn="0" w:lastColumn="0" w:oddVBand="0" w:evenVBand="0" w:oddHBand="0" w:evenHBand="0" w:firstRowFirstColumn="0" w:firstRowLastColumn="0" w:lastRowFirstColumn="0" w:lastRowLastColumn="0"/>
-              <w:rPr>
-                <w:rFonts w:hint="eastAsia"/>
-              </w:rPr>
             </w:pPr>
             <w:r>
               <w:t>Alternativa</w:t>
@@ -1191,9 +1170,6 @@
           <w:p>
             <w:pPr>
               <w:cnfStyle w:val="100000000000" w:firstRow="1" w:lastRow="0" w:firstColumn="0" w:lastColumn="0" w:oddVBand="0" w:evenVBand="0" w:oddHBand="0" w:evenHBand="0" w:firstRowFirstColumn="0" w:firstRowLastColumn="0" w:lastRowFirstColumn="0" w:lastRowLastColumn="0"/>
-              <w:rPr>
-                <w:rFonts w:hint="eastAsia"/>
-              </w:rPr>
             </w:pPr>
             <w:r>
               <w:t>FIRST</w:t>
@@ -1212,11 +1188,6 @@
             <w:tcW w:w="3293" w:type="dxa"/>
           </w:tcPr>
           <w:p>
-            <w:pPr>
-              <w:rPr>
-                <w:rFonts w:hint="eastAsia"/>
-              </w:rPr>
-            </w:pPr>
             <w:r>
               <w:t>expr</w:t>
             </w:r>
@@ -1229,9 +1200,6 @@
           <w:p>
             <w:pPr>
               <w:cnfStyle w:val="000000100000" w:firstRow="0" w:lastRow="0" w:firstColumn="0" w:lastColumn="0" w:oddVBand="0" w:evenVBand="0" w:oddHBand="1" w:evenHBand="0" w:firstRowFirstColumn="0" w:firstRowLastColumn="0" w:lastRowFirstColumn="0" w:lastRowLastColumn="0"/>
-              <w:rPr>
-                <w:rFonts w:hint="eastAsia"/>
-              </w:rPr>
             </w:pPr>
             <w:r>
               <w:t>term R</w:t>
@@ -1245,9 +1213,6 @@
           <w:p>
             <w:pPr>
               <w:cnfStyle w:val="000000100000" w:firstRow="0" w:lastRow="0" w:firstColumn="0" w:lastColumn="0" w:oddVBand="0" w:evenVBand="0" w:oddHBand="1" w:evenHBand="0" w:firstRowFirstColumn="0" w:firstRowLastColumn="0" w:lastRowFirstColumn="0" w:lastRowLastColumn="0"/>
-              <w:rPr>
-                <w:rFonts w:hint="eastAsia"/>
-              </w:rPr>
             </w:pPr>
             <w:r>
               <w:t>{ (, num }</w:t>
@@ -1265,11 +1230,6 @@
             <w:tcW w:w="3293" w:type="dxa"/>
           </w:tcPr>
           <w:p>
-            <w:pPr>
-              <w:rPr>
-                <w:rFonts w:hint="eastAsia"/>
-              </w:rPr>
-            </w:pPr>
             <w:r>
               <w:t>R</w:t>
             </w:r>
@@ -1282,9 +1242,6 @@
           <w:p>
             <w:pPr>
               <w:cnfStyle w:val="000000000000" w:firstRow="0" w:lastRow="0" w:firstColumn="0" w:lastColumn="0" w:oddVBand="0" w:evenVBand="0" w:oddHBand="0" w:evenHBand="0" w:firstRowFirstColumn="0" w:firstRowLastColumn="0" w:lastRowFirstColumn="0" w:lastRowLastColumn="0"/>
-              <w:rPr>
-                <w:rFonts w:hint="eastAsia"/>
-              </w:rPr>
             </w:pPr>
             <w:r>
               <w:t>+ term R</w:t>
@@ -1298,9 +1255,6 @@
           <w:p>
             <w:pPr>
               <w:cnfStyle w:val="000000000000" w:firstRow="0" w:lastRow="0" w:firstColumn="0" w:lastColumn="0" w:oddVBand="0" w:evenVBand="0" w:oddHBand="0" w:evenHBand="0" w:firstRowFirstColumn="0" w:firstRowLastColumn="0" w:lastRowFirstColumn="0" w:lastRowLastColumn="0"/>
-              <w:rPr>
-                <w:rFonts w:hint="eastAsia"/>
-              </w:rPr>
             </w:pPr>
             <w:r>
               <w:t>{ + }</w:t>
@@ -1319,11 +1273,6 @@
             <w:tcW w:w="3293" w:type="dxa"/>
           </w:tcPr>
           <w:p>
-            <w:pPr>
-              <w:rPr>
-                <w:rFonts w:hint="eastAsia"/>
-              </w:rPr>
-            </w:pPr>
             <w:r>
               <w:t>R</w:t>
             </w:r>
@@ -1336,9 +1285,6 @@
           <w:p>
             <w:pPr>
               <w:cnfStyle w:val="000000100000" w:firstRow="0" w:lastRow="0" w:firstColumn="0" w:lastColumn="0" w:oddVBand="0" w:evenVBand="0" w:oddHBand="1" w:evenHBand="0" w:firstRowFirstColumn="0" w:firstRowLastColumn="0" w:lastRowFirstColumn="0" w:lastRowLastColumn="0"/>
-              <w:rPr>
-                <w:rFonts w:hint="eastAsia"/>
-              </w:rPr>
             </w:pPr>
             <w:r>
               <w:t>- term R</w:t>
@@ -1352,9 +1298,6 @@
           <w:p>
             <w:pPr>
               <w:cnfStyle w:val="000000100000" w:firstRow="0" w:lastRow="0" w:firstColumn="0" w:lastColumn="0" w:oddVBand="0" w:evenVBand="0" w:oddHBand="1" w:evenHBand="0" w:firstRowFirstColumn="0" w:firstRowLastColumn="0" w:lastRowFirstColumn="0" w:lastRowLastColumn="0"/>
-              <w:rPr>
-                <w:rFonts w:hint="eastAsia"/>
-              </w:rPr>
             </w:pPr>
             <w:r>
               <w:t>{ - }</w:t>
@@ -1372,11 +1315,6 @@
             <w:tcW w:w="3293" w:type="dxa"/>
           </w:tcPr>
           <w:p>
-            <w:pPr>
-              <w:rPr>
-                <w:rFonts w:hint="eastAsia"/>
-              </w:rPr>
-            </w:pPr>
             <w:r>
               <w:t>R</w:t>
             </w:r>
@@ -1389,9 +1327,6 @@
           <w:p>
             <w:pPr>
               <w:cnfStyle w:val="000000000000" w:firstRow="0" w:lastRow="0" w:firstColumn="0" w:lastColumn="0" w:oddVBand="0" w:evenVBand="0" w:oddHBand="0" w:evenHBand="0" w:firstRowFirstColumn="0" w:firstRowLastColumn="0" w:lastRowFirstColumn="0" w:lastRowLastColumn="0"/>
-              <w:rPr>
-                <w:rFonts w:hint="eastAsia"/>
-              </w:rPr>
             </w:pPr>
             <w:r>
               <w:t>ε</w:t>
@@ -1405,9 +1340,6 @@
           <w:p>
             <w:pPr>
               <w:cnfStyle w:val="000000000000" w:firstRow="0" w:lastRow="0" w:firstColumn="0" w:lastColumn="0" w:oddVBand="0" w:evenVBand="0" w:oddHBand="0" w:evenHBand="0" w:firstRowFirstColumn="0" w:firstRowLastColumn="0" w:lastRowFirstColumn="0" w:lastRowLastColumn="0"/>
-              <w:rPr>
-                <w:rFonts w:hint="eastAsia"/>
-              </w:rPr>
             </w:pPr>
             <w:r>
               <w:t>{ ε }</w:t>
@@ -1426,11 +1358,6 @@
             <w:tcW w:w="3293" w:type="dxa"/>
           </w:tcPr>
           <w:p>
-            <w:pPr>
-              <w:rPr>
-                <w:rFonts w:hint="eastAsia"/>
-              </w:rPr>
-            </w:pPr>
             <w:r>
               <w:t>term</w:t>
             </w:r>
@@ -1443,9 +1370,6 @@
           <w:p>
             <w:pPr>
               <w:cnfStyle w:val="000000100000" w:firstRow="0" w:lastRow="0" w:firstColumn="0" w:lastColumn="0" w:oddVBand="0" w:evenVBand="0" w:oddHBand="1" w:evenHBand="0" w:firstRowFirstColumn="0" w:firstRowLastColumn="0" w:lastRowFirstColumn="0" w:lastRowLastColumn="0"/>
-              <w:rPr>
-                <w:rFonts w:hint="eastAsia"/>
-              </w:rPr>
             </w:pPr>
             <w:r>
               <w:t>fact T</w:t>
@@ -1459,9 +1383,6 @@
           <w:p>
             <w:pPr>
               <w:cnfStyle w:val="000000100000" w:firstRow="0" w:lastRow="0" w:firstColumn="0" w:lastColumn="0" w:oddVBand="0" w:evenVBand="0" w:oddHBand="1" w:evenHBand="0" w:firstRowFirstColumn="0" w:firstRowLastColumn="0" w:lastRowFirstColumn="0" w:lastRowLastColumn="0"/>
-              <w:rPr>
-                <w:rFonts w:hint="eastAsia"/>
-              </w:rPr>
             </w:pPr>
             <w:r>
               <w:t>{ (, num }</w:t>
@@ -1479,11 +1400,6 @@
             <w:tcW w:w="3293" w:type="dxa"/>
           </w:tcPr>
           <w:p>
-            <w:pPr>
-              <w:rPr>
-                <w:rFonts w:hint="eastAsia"/>
-              </w:rPr>
-            </w:pPr>
             <w:r>
               <w:t>T</w:t>
             </w:r>
@@ -1496,9 +1412,6 @@
           <w:p>
             <w:pPr>
               <w:cnfStyle w:val="000000000000" w:firstRow="0" w:lastRow="0" w:firstColumn="0" w:lastColumn="0" w:oddVBand="0" w:evenVBand="0" w:oddHBand="0" w:evenHBand="0" w:firstRowFirstColumn="0" w:firstRowLastColumn="0" w:lastRowFirstColumn="0" w:lastRowLastColumn="0"/>
-              <w:rPr>
-                <w:rFonts w:hint="eastAsia"/>
-              </w:rPr>
             </w:pPr>
             <w:r>
               <w:t>* fact T</w:t>
@@ -1512,9 +1425,6 @@
           <w:p>
             <w:pPr>
               <w:cnfStyle w:val="000000000000" w:firstRow="0" w:lastRow="0" w:firstColumn="0" w:lastColumn="0" w:oddVBand="0" w:evenVBand="0" w:oddHBand="0" w:evenHBand="0" w:firstRowFirstColumn="0" w:firstRowLastColumn="0" w:lastRowFirstColumn="0" w:lastRowLastColumn="0"/>
-              <w:rPr>
-                <w:rFonts w:hint="eastAsia"/>
-              </w:rPr>
             </w:pPr>
             <w:r>
               <w:t>{ * }</w:t>
@@ -1533,11 +1443,6 @@
             <w:tcW w:w="3293" w:type="dxa"/>
           </w:tcPr>
           <w:p>
-            <w:pPr>
-              <w:rPr>
-                <w:rFonts w:hint="eastAsia"/>
-              </w:rPr>
-            </w:pPr>
             <w:r>
               <w:t>T</w:t>
             </w:r>
@@ -1550,9 +1455,6 @@
           <w:p>
             <w:pPr>
               <w:cnfStyle w:val="000000100000" w:firstRow="0" w:lastRow="0" w:firstColumn="0" w:lastColumn="0" w:oddVBand="0" w:evenVBand="0" w:oddHBand="1" w:evenHBand="0" w:firstRowFirstColumn="0" w:firstRowLastColumn="0" w:lastRowFirstColumn="0" w:lastRowLastColumn="0"/>
-              <w:rPr>
-                <w:rFonts w:hint="eastAsia"/>
-              </w:rPr>
             </w:pPr>
             <w:r>
               <w:t>/ fact T</w:t>
@@ -1566,9 +1468,6 @@
           <w:p>
             <w:pPr>
               <w:cnfStyle w:val="000000100000" w:firstRow="0" w:lastRow="0" w:firstColumn="0" w:lastColumn="0" w:oddVBand="0" w:evenVBand="0" w:oddHBand="1" w:evenHBand="0" w:firstRowFirstColumn="0" w:firstRowLastColumn="0" w:lastRowFirstColumn="0" w:lastRowLastColumn="0"/>
-              <w:rPr>
-                <w:rFonts w:hint="eastAsia"/>
-              </w:rPr>
             </w:pPr>
             <w:r>
               <w:t>{ / }</w:t>
@@ -1586,11 +1485,6 @@
             <w:tcW w:w="3293" w:type="dxa"/>
           </w:tcPr>
           <w:p>
-            <w:pPr>
-              <w:rPr>
-                <w:rFonts w:hint="eastAsia"/>
-              </w:rPr>
-            </w:pPr>
             <w:r>
               <w:t>T</w:t>
             </w:r>
@@ -1603,9 +1497,6 @@
           <w:p>
             <w:pPr>
               <w:cnfStyle w:val="000000000000" w:firstRow="0" w:lastRow="0" w:firstColumn="0" w:lastColumn="0" w:oddVBand="0" w:evenVBand="0" w:oddHBand="0" w:evenHBand="0" w:firstRowFirstColumn="0" w:firstRowLastColumn="0" w:lastRowFirstColumn="0" w:lastRowLastColumn="0"/>
-              <w:rPr>
-                <w:rFonts w:hint="eastAsia"/>
-              </w:rPr>
             </w:pPr>
             <w:r>
               <w:t>ε</w:t>
@@ -1619,9 +1510,6 @@
           <w:p>
             <w:pPr>
               <w:cnfStyle w:val="000000000000" w:firstRow="0" w:lastRow="0" w:firstColumn="0" w:lastColumn="0" w:oddVBand="0" w:evenVBand="0" w:oddHBand="0" w:evenHBand="0" w:firstRowFirstColumn="0" w:firstRowLastColumn="0" w:lastRowFirstColumn="0" w:lastRowLastColumn="0"/>
-              <w:rPr>
-                <w:rFonts w:hint="eastAsia"/>
-              </w:rPr>
             </w:pPr>
             <w:r>
               <w:t>{ ε }</w:t>
@@ -1640,11 +1528,6 @@
             <w:tcW w:w="3293" w:type="dxa"/>
           </w:tcPr>
           <w:p>
-            <w:pPr>
-              <w:rPr>
-                <w:rFonts w:hint="eastAsia"/>
-              </w:rPr>
-            </w:pPr>
             <w:r>
               <w:t>fact</w:t>
             </w:r>
@@ -1657,9 +1540,6 @@
           <w:p>
             <w:pPr>
               <w:cnfStyle w:val="000000100000" w:firstRow="0" w:lastRow="0" w:firstColumn="0" w:lastColumn="0" w:oddVBand="0" w:evenVBand="0" w:oddHBand="1" w:evenHBand="0" w:firstRowFirstColumn="0" w:firstRowLastColumn="0" w:lastRowFirstColumn="0" w:lastRowLastColumn="0"/>
-              <w:rPr>
-                <w:rFonts w:hint="eastAsia"/>
-              </w:rPr>
             </w:pPr>
             <w:r>
               <w:t>( expr )</w:t>
@@ -1673,9 +1553,6 @@
           <w:p>
             <w:pPr>
               <w:cnfStyle w:val="000000100000" w:firstRow="0" w:lastRow="0" w:firstColumn="0" w:lastColumn="0" w:oddVBand="0" w:evenVBand="0" w:oddHBand="1" w:evenHBand="0" w:firstRowFirstColumn="0" w:firstRowLastColumn="0" w:lastRowFirstColumn="0" w:lastRowLastColumn="0"/>
-              <w:rPr>
-                <w:rFonts w:hint="eastAsia"/>
-              </w:rPr>
             </w:pPr>
             <w:r>
               <w:t>{ ( }</w:t>
@@ -1693,11 +1570,6 @@
             <w:tcW w:w="3293" w:type="dxa"/>
           </w:tcPr>
           <w:p>
-            <w:pPr>
-              <w:rPr>
-                <w:rFonts w:hint="eastAsia"/>
-              </w:rPr>
-            </w:pPr>
             <w:r>
               <w:t>fact</w:t>
             </w:r>
@@ -1710,9 +1582,6 @@
           <w:p>
             <w:pPr>
               <w:cnfStyle w:val="000000000000" w:firstRow="0" w:lastRow="0" w:firstColumn="0" w:lastColumn="0" w:oddVBand="0" w:evenVBand="0" w:oddHBand="0" w:evenHBand="0" w:firstRowFirstColumn="0" w:firstRowLastColumn="0" w:lastRowFirstColumn="0" w:lastRowLastColumn="0"/>
-              <w:rPr>
-                <w:rFonts w:hint="eastAsia"/>
-              </w:rPr>
             </w:pPr>
             <w:r>
               <w:t>num</w:t>
@@ -1726,9 +1595,6 @@
           <w:p>
             <w:pPr>
               <w:cnfStyle w:val="000000000000" w:firstRow="0" w:lastRow="0" w:firstColumn="0" w:lastColumn="0" w:oddVBand="0" w:evenVBand="0" w:oddHBand="0" w:evenHBand="0" w:firstRowFirstColumn="0" w:firstRowLastColumn="0" w:lastRowFirstColumn="0" w:lastRowLastColumn="0"/>
-              <w:rPr>
-                <w:rFonts w:hint="eastAsia"/>
-              </w:rPr>
             </w:pPr>
             <w:r>
               <w:t>{ num }</w:t>
@@ -1740,7 +1606,6 @@
     <w:p>
       <w:pPr>
         <w:rPr>
-          <w:rFonts w:hint="eastAsia"/>
           <w:lang w:val="pt-BR"/>
         </w:rPr>
       </w:pPr>
@@ -1791,7 +1656,6 @@
     <w:p>
       <w:pPr>
         <w:rPr>
-          <w:rFonts w:hint="eastAsia"/>
           <w:lang w:val="pt-BR"/>
         </w:rPr>
       </w:pPr>
@@ -1805,7 +1669,6 @@
     <w:p>
       <w:pPr>
         <w:rPr>
-          <w:rFonts w:hint="eastAsia"/>
           <w:lang w:val="pt-BR"/>
         </w:rPr>
       </w:pPr>
@@ -1834,7 +1697,6 @@
       <w:pPr>
         <w:spacing w:after="120" w:line="252" w:lineRule="auto"/>
         <w:rPr>
-          <w:rFonts w:hint="eastAsia"/>
           <w:lang w:val="pt-BR"/>
         </w:rPr>
       </w:pPr>
@@ -2130,7 +1992,6 @@
     <w:p>
       <w:pPr>
         <w:rPr>
-          <w:rFonts w:hint="eastAsia"/>
           <w:lang w:val="pt-BR"/>
         </w:rPr>
       </w:pPr>
@@ -2174,7 +2035,6 @@
       <w:pPr>
         <w:spacing w:after="120" w:line="252" w:lineRule="auto"/>
         <w:rPr>
-          <w:rFonts w:hint="eastAsia"/>
           <w:lang w:val="pt-BR"/>
         </w:rPr>
       </w:pPr>
@@ -2595,7 +2455,6 @@
     <w:p>
       <w:pPr>
         <w:rPr>
-          <w:rFonts w:hint="eastAsia"/>
           <w:lang w:val="pt-BR"/>
         </w:rPr>
       </w:pPr>
@@ -2637,7 +2496,6 @@
     <w:p>
       <w:pPr>
         <w:rPr>
-          <w:rFonts w:hint="eastAsia"/>
           <w:lang w:val="pt-BR"/>
         </w:rPr>
       </w:pPr>
@@ -2666,15 +2524,28 @@
     <w:p>
       <w:pPr>
         <w:rPr>
-          <w:rFonts w:hint="eastAsia"/>
           <w:lang w:val="pt-BR"/>
         </w:rPr>
       </w:pPr>
       <w:r>
         <w:rPr>
-          <w:lang w:val="pt-BR"/>
-        </w:rPr>
-        <w:t xml:space="preserve">Planejamento da Parte B: utilizar Python 3.10+ e somente a biblioteca padrão; implementar analisador descendente recursivo preditivo manual, com um procedimento por não-terminal; realizar reconhecimento de números de múltiplos dígitos e ignorar espaços e tabulações em </w:t>
+          <w:b/>
+          <w:bCs/>
+          <w:lang w:val="pt-BR"/>
+        </w:rPr>
+        <w:t>Decisões de implementação:</w:t>
+      </w:r>
+      <w:r>
+        <w:rPr>
+          <w:lang w:val="pt-BR"/>
+        </w:rPr>
+        <w:t xml:space="preserve"> </w:t>
+      </w:r>
+      <w:r>
+        <w:rPr>
+          <w:lang w:val="pt-BR"/>
+        </w:rPr>
+        <w:t xml:space="preserve">O tradutor foi implementado em Python, utilizando apenas a biblioteca padrão. A análise sintática é realizada manualmente por procedimentos correspondentes aos componentes da gramática, com o auxílio das funções </w:t>
       </w:r>
       <w:proofErr w:type="spellStart"/>
       <w:r>
@@ -2688,13 +2559,12 @@
         <w:rPr>
           <w:lang w:val="pt-BR"/>
         </w:rPr>
-        <w:t>; emitir tokens separados por um espaço. Essas decisões devem ser confirmadas e atualizadas quando a implementação for concluída.</w:t>
+        <w:t>() e match() para reconhecer os elementos da entrada e verificar se correspondem ao esperado.</w:t>
       </w:r>
     </w:p>
     <w:p>
       <w:pPr>
         <w:rPr>
-          <w:rFonts w:hint="eastAsia"/>
           <w:lang w:val="pt-BR"/>
         </w:rPr>
       </w:pPr>
@@ -2702,8 +2572,152 @@
         <w:rPr>
           <w:lang w:val="pt-BR"/>
         </w:rPr>
-        <w:t>Limitações conhecidas: [PREENCHER APÓS IMPLEMENTAÇÃO E TESTES].</w:t>
-      </w:r>
+        <w:t xml:space="preserve">A função </w:t>
+      </w:r>
+      <w:proofErr w:type="spellStart"/>
+      <w:r>
+        <w:rPr>
+          <w:lang w:val="pt-BR"/>
+        </w:rPr>
+        <w:t>proximo</w:t>
+      </w:r>
+      <w:proofErr w:type="spellEnd"/>
+      <w:r>
+        <w:rPr>
+          <w:lang w:val="pt-BR"/>
+        </w:rPr>
+        <w:t xml:space="preserve">() ignora espaços e tabulações, reconhece números com vários dígitos como um único token e identifica os operadores e parênteses aceitos. As funções </w:t>
+      </w:r>
+      <w:proofErr w:type="spellStart"/>
+      <w:r>
+        <w:rPr>
+          <w:lang w:val="pt-BR"/>
+        </w:rPr>
+        <w:t>expr</w:t>
+      </w:r>
+      <w:proofErr w:type="spellEnd"/>
+      <w:r>
+        <w:rPr>
+          <w:lang w:val="pt-BR"/>
+        </w:rPr>
+        <w:t xml:space="preserve">(), </w:t>
+      </w:r>
+      <w:proofErr w:type="spellStart"/>
+      <w:r>
+        <w:rPr>
+          <w:lang w:val="pt-BR"/>
+        </w:rPr>
+        <w:t>term</w:t>
+      </w:r>
+      <w:proofErr w:type="spellEnd"/>
+      <w:r>
+        <w:rPr>
+          <w:lang w:val="pt-BR"/>
+        </w:rPr>
+        <w:t xml:space="preserve">() e </w:t>
+      </w:r>
+      <w:proofErr w:type="spellStart"/>
+      <w:r>
+        <w:rPr>
+          <w:lang w:val="pt-BR"/>
+        </w:rPr>
+        <w:t>fact</w:t>
+      </w:r>
+      <w:proofErr w:type="spellEnd"/>
+      <w:r>
+        <w:rPr>
+          <w:lang w:val="pt-BR"/>
+        </w:rPr>
+        <w:t>() organizam a análise de acordo com a precedência dos operadores. As funções auxiliares R() e T() processam, respectivamente, as operações de adição e subtração e as operações de multiplicação e divisão.</w:t>
+      </w:r>
+    </w:p>
+    <w:p>
+      <w:pPr>
+        <w:rPr>
+          <w:lang w:val="pt-BR"/>
+        </w:rPr>
+      </w:pPr>
+      <w:r>
+        <w:rPr>
+          <w:lang w:val="pt-BR"/>
+        </w:rPr>
+        <w:t xml:space="preserve">A saída é construída durante a análise sintática, adicionando cada operador após o reconhecimento de seus operandos, conforme a notação pós-fixa. O programa permite processar várias expressões, uma por linha, tanto pela entrada padrão quanto por um arquivo informado como argumento. A função </w:t>
+      </w:r>
+      <w:proofErr w:type="spellStart"/>
+      <w:r>
+        <w:rPr>
+          <w:lang w:val="pt-BR"/>
+        </w:rPr>
+        <w:t>main</w:t>
+      </w:r>
+      <w:proofErr w:type="spellEnd"/>
+      <w:r>
+        <w:rPr>
+          <w:lang w:val="pt-BR"/>
+        </w:rPr>
+        <w:t xml:space="preserve">() seleciona a origem da entrada, enquanto </w:t>
+      </w:r>
+      <w:proofErr w:type="spellStart"/>
+      <w:r>
+        <w:rPr>
+          <w:lang w:val="pt-BR"/>
+        </w:rPr>
+        <w:t>processar_entrada</w:t>
+      </w:r>
+      <w:proofErr w:type="spellEnd"/>
+      <w:r>
+        <w:rPr>
+          <w:lang w:val="pt-BR"/>
+        </w:rPr>
+        <w:t>() percorre as linhas, ignora as vazias e encaminha cada expressão para tradução.</w:t>
+      </w:r>
+    </w:p>
+    <w:p>
+      <w:pPr>
+        <w:rPr>
+          <w:lang w:val="pt-BR"/>
+        </w:rPr>
+      </w:pPr>
+      <w:r>
+        <w:rPr>
+          <w:b/>
+          <w:bCs/>
+          <w:lang w:val="pt-BR"/>
+        </w:rPr>
+        <w:t>Limitações conhecidas:</w:t>
+      </w:r>
+      <w:r>
+        <w:rPr>
+          <w:lang w:val="pt-BR"/>
+        </w:rPr>
+        <w:t xml:space="preserve"> </w:t>
+      </w:r>
+      <w:r>
+        <w:rPr>
+          <w:lang w:val="pt-BR"/>
+        </w:rPr>
+        <w:t>O tradutor aceita números inteiros não negativos, os operadores +, -, * e /, e parênteses. Não contempla números decimais, operadores unários, variáveis ou outros operadores além dos previstos na gramática. O programa gera a representação pós-fixa, mas não calcula o resultado numérico da expressão.</w:t>
+      </w:r>
+    </w:p>
+    <w:p>
+      <w:pPr>
+        <w:rPr>
+          <w:lang w:val="pt-BR"/>
+        </w:rPr>
+      </w:pPr>
+      <w:r>
+        <w:rPr>
+          <w:lang w:val="pt-BR"/>
+        </w:rPr>
+        <w:t>Os testes realizados verificam a precedência e a associatividade dos operadores, o uso de parênteses, inclusive aninhados, e o reconhecimento de números com vários dígitos. A implementação também prevê o tratamento de expressões inválidas, informando o erro na saída de erros e continuando o processamento das próximas linhas.</w:t>
+      </w:r>
+    </w:p>
+    <w:p>
+      <w:pPr>
+        <w:rPr>
+          <w:lang w:val="pt-BR"/>
+        </w:rPr>
+      </w:pPr>
     </w:p>
     <w:p>
       <w:pPr>
@@ -2716,13 +2730,13 @@
         <w:rPr>
           <w:lang w:val="pt-BR"/>
         </w:rPr>
+        <w:lastRenderedPageBreak/>
         <w:t>Declaração de uso de inteligência artificial</w:t>
       </w:r>
     </w:p>
     <w:p>
       <w:pPr>
         <w:rPr>
-          <w:rFonts w:hint="eastAsia"/>
           <w:lang w:val="pt-BR"/>
         </w:rPr>
       </w:pPr>
@@ -2756,9 +2770,6 @@
     <w:p>
       <w:pPr>
         <w:spacing w:after="0" w:line="240" w:lineRule="auto"/>
-        <w:rPr>
-          <w:rFonts w:hint="eastAsia"/>
-        </w:rPr>
       </w:pPr>
       <w:r>
         <w:separator/>
@@ -2769,9 +2780,6 @@
     <w:p>
       <w:pPr>
         <w:spacing w:after="0" w:line="240" w:lineRule="auto"/>
-        <w:rPr>
-          <w:rFonts w:hint="eastAsia"/>
-        </w:rPr>
       </w:pPr>
       <w:r>
         <w:continuationSeparator/>
@@ -2787,9 +2795,6 @@
     <w:pPr>
       <w:pStyle w:val="Rodap"/>
       <w:jc w:val="center"/>
-      <w:rPr>
-        <w:rFonts w:hint="eastAsia"/>
-      </w:rPr>
     </w:pPr>
   </w:p>
 </w:ftr>
@@ -2801,9 +2806,6 @@
     <w:p>
       <w:pPr>
         <w:spacing w:after="0" w:line="240" w:lineRule="auto"/>
-        <w:rPr>
-          <w:rFonts w:hint="eastAsia"/>
-        </w:rPr>
       </w:pPr>
       <w:r>
         <w:separator/>
@@ -2814,9 +2816,6 @@
     <w:p>
       <w:pPr>
         <w:spacing w:after="0" w:line="240" w:lineRule="auto"/>
-        <w:rPr>
-          <w:rFonts w:hint="eastAsia"/>
-        </w:rPr>
       </w:pPr>
       <w:r>
         <w:continuationSeparator/>
@@ -3639,7 +3638,6 @@
   <w:style w:type="character" w:default="1" w:styleId="Fontepargpadro">
     <w:name w:val="Default Paragraph Font"/>
     <w:uiPriority w:val="1"/>
-    <w:semiHidden/>
     <w:unhideWhenUsed/>
   </w:style>
   <w:style w:type="table" w:default="1" w:styleId="Tabelanormal">
@@ -14415,6 +14413,19 @@
         <w:shd w:val="clear" w:color="auto" w:fill="FBCAA2" w:themeFill="accent6" w:themeFillTint="7F"/>
       </w:tcPr>
     </w:tblStylePr>
+  </w:style>
+  <w:style w:type="paragraph" w:styleId="NormalWeb">
+    <w:name w:val="Normal (Web)"/>
+    <w:basedOn w:val="Normal"/>
+    <w:uiPriority w:val="99"/>
+    <w:semiHidden/>
+    <w:unhideWhenUsed/>
+    <w:rsid w:val="004025C9"/>
+    <w:rPr>
+      <w:rFonts w:ascii="Times New Roman" w:hAnsi="Times New Roman" w:cs="Times New Roman"/>
+      <w:sz w:val="24"/>
+      <w:szCs w:val="24"/>
+    </w:rPr>
   </w:style>
 </w:styles>
 </file>

</xml_diff>